<commit_message>
Lean version: Boston Dynamics bullets match Troy's current description; CATIA bullet dropped
Co-Authored-By: Claude Opus 5.5 <noreply@anthropic.com>
Claude-Session: https://claude.ai/code/session_01T9nbdhkspWtnGiL4jPYAQr
</commit_message>
<xml_diff>
--- a/resume-loop/build/Troy_Mayer_Resume_lean.docx
+++ b/resume-loop/build/Troy_Mayer_Resume_lean.docx
@@ -375,7 +375,7 @@
           <w:i w:val="0"/>
           <w:sz w:val="21"/>
         </w:rPr>
-        <w:t xml:space="preserve">Mapping Atlas impacts onto the robot mesh with </w:t>
+        <w:t xml:space="preserve">Mapping impacts onto Atlas’s mesh with encoders and </w:t>
       </w:r>
       <w:r>
         <w:rPr>
@@ -383,7 +383,7 @@
           <w:i w:val="0"/>
           <w:sz w:val="21"/>
         </w:rPr>
-        <w:t>floating-base forward kinematics</w:t>
+        <w:t>forward kinematics</w:t>
       </w:r>
       <w:r>
         <w:rPr>
@@ -391,7 +391,7 @@
           <w:i w:val="0"/>
           <w:sz w:val="21"/>
         </w:rPr>
-        <w:t xml:space="preserve"> from joint encoders, and estimating impact energy from operational-space effective mass and a fitted impact velocity.</w:t>
+        <w:t>, estimating impact energy from Khatib’s operational-space effective mass and an OLS velocity fit; building a physics-based MuJoCo impact simulation.</w:t>
       </w:r>
     </w:p>
     <w:p>
@@ -408,7 +408,7 @@
           <w:i w:val="0"/>
           <w:sz w:val="21"/>
         </w:rPr>
-        <w:t>Designed a delta-v impact-severity metric that stays accurate when sensors miss an impact’s peak, and characterized its filtering and noise floor with synthetic and null-control tests.</w:t>
+        <w:t>Building an impact forensics pipeline and Flask/Plotly dashboard on a Linux VM over ~28k impact events from ~900 test logs: ETL into SQLite, a 3D impact heatmap, and per-event waveforms used by engineers during testing.</w:t>
       </w:r>
     </w:p>
     <w:p>
@@ -425,7 +425,7 @@
           <w:i w:val="0"/>
           <w:sz w:val="21"/>
         </w:rPr>
-        <w:t>Building an impact forensics pipeline and dashboard (Python, Flask, SQLite) over ~28k impacts from Atlas test logs, used by engineers during testing.</w:t>
+        <w:t>Modeling hardware thermal behavior in Python, using Savitzky-Golay filtering and multi-start least squares to predict steady-state temperatures across hundreds of units without full-length tests.</w:t>
       </w:r>
     </w:p>
     <w:p>
@@ -550,7 +550,7 @@
           <w:i w:val="0"/>
           <w:sz w:val="21"/>
         </w:rPr>
-        <w:t>Stress-tested it against foot slip and contact latency, found that tilt is only weakly observable on straight walks, and fixed the tilt and latency failures.</w:t>
+        <w:t>Stress-tested it under foot slip and contact latency, found tilt only weakly observable on straight walks, and fixed the tilt and latency failures.</w:t>
       </w:r>
     </w:p>
     <w:p>
@@ -567,7 +567,7 @@
           <w:i w:val="0"/>
           <w:sz w:val="21"/>
         </w:rPr>
-        <w:t>Closed the loop in Python simulation, with the walking controller running on the estimate without a fall; also added an MIT Cheetah 3-style QP balance controller.</w:t>
+        <w:t>Closed the loop in Python simulation: the walking controller runs on the estimate without a fall, plus an MIT Cheetah 3-style QP balance controller.</w:t>
       </w:r>
     </w:p>
     <w:p>
@@ -667,7 +667,7 @@
           <w:i w:val="0"/>
           <w:sz w:val="21"/>
         </w:rPr>
-        <w:t>Wrote the FreeRTOS firmware around it, with fault monitors, a hardware watchdog, and a kill switch, tested in CI with GoogleTest.</w:t>
+        <w:t>Wrote the FreeRTOS firmware with fault monitors, a watchdog, and a kill switch, tested with GoogleTest in CI.</w:t>
       </w:r>
     </w:p>
     <w:p>
@@ -684,7 +684,7 @@
           <w:i w:val="0"/>
           <w:sz w:val="21"/>
         </w:rPr>
-        <w:t>Cut EMG-to-motion latency from 103 to 43 ms in simulation on real recorded EMG by reworking the signal processing and loop tuning.</w:t>
+        <w:t>Cut simulated EMG-to-motion latency from 103 to 43 ms on real EMG via new signal processing and loop tuning.</w:t>
       </w:r>
     </w:p>
     <w:p>
@@ -759,7 +759,7 @@
           <w:i w:val="0"/>
           <w:sz w:val="21"/>
         </w:rPr>
-        <w:t>Building a three-legged hopping robot and a landing test rig, and designing its push-off, landing, and mid-air attitude control with MuJoCo simulation.</w:t>
+        <w:t>Building a 3-legged hopping robot and landing rig; designing push-off, landing, and mid-air attitude control in MuJoCo.</w:t>
       </w:r>
     </w:p>
     <w:p>
@@ -833,7 +833,7 @@
           <w:i w:val="0"/>
           <w:sz w:val="21"/>
         </w:rPr>
-        <w:t>Built LSTM and XGBoost forecasts of daily paint consumption with Monte Carlo confidence intervals, contributing to a 4.7% reduction in material usage.</w:t>
+        <w:t>Built LSTM/XGBoost forecasts of daily paint use with Monte Carlo confidence intervals, contributing to 4.7% less material use.</w:t>
       </w:r>
     </w:p>
     <w:p>
@@ -949,7 +949,7 @@
           <w:i w:val="0"/>
           <w:sz w:val="21"/>
         </w:rPr>
-        <w:t>Designed and CNC-machined a spring canister for an industrial rotary valve in Creo with GD&amp;T drawings, and ran UL 429 validation testing on solenoid valves.</w:t>
+        <w:t>Designed and CNC-machined a spring canister for an industrial rotary valve in Creo with GD&amp;T drawings; ran UL 429 validation on solenoid valves.</w:t>
       </w:r>
     </w:p>
     <w:sectPr>

</xml_diff>